<commit_message>
Geschichte 11: Methodenblatt Verfassungsschaubild erklären, Figurenkarten
Co-Authored-By: Claude Opus 5.5 <noreply@anthropic.com>
Claude-Session: https://claude.ai/code/session_013iN4Tiarea1J9YUJHZ9iqC
</commit_message>
<xml_diff>
--- a/Geschichte_11/Stunde_Solon_Verfassung/Handreichung_Wer_hat_Athen_gerechter_gemacht.docx
+++ b/Geschichte_11/Stunde_Solon_Verfassung/Handreichung_Wer_hat_Athen_gerechter_gemacht.docx
@@ -313,7 +313,7 @@
                 <w:sz w:val="18"/>
                 <w:szCs w:val="18"/>
               </w:rPr>
-              <w:t xml:space="preserve">Figurenkarten mit Endschildern</w:t>
+              <w:t xml:space="preserve">Ein Verfassungsschaubild erklären</w:t>
             </w:r>
           </w:p>
           <w:p>
@@ -325,7 +325,7 @@
                 <w:sz w:val="18"/>
                 <w:szCs w:val="18"/>
               </w:rPr>
-              <w:t xml:space="preserve">Figurenkarten_Tafel.docx (Ordner Doppelstunde_Solon)</w:t>
+              <w:t xml:space="preserve">Schaubild_erklaeren_A5.docx</w:t>
             </w:r>
           </w:p>
         </w:tc>
@@ -354,7 +354,7 @@
                 <w:sz w:val="18"/>
                 <w:szCs w:val="18"/>
               </w:rPr>
-              <w:t xml:space="preserve">1 × (5 Seiten)</w:t>
+              <w:t xml:space="preserve">halb so viele Blätter wie Schüler</w:t>
             </w:r>
           </w:p>
         </w:tc>
@@ -383,7 +383,7 @@
                 <w:sz w:val="18"/>
                 <w:szCs w:val="18"/>
               </w:rPr>
-              <w:t xml:space="preserve">Falls schon gedruckt: wiederverwenden. 9 Karten, dazu Magnete.</w:t>
+              <w:t xml:space="preserve">A4 quer, 2 Exemplare pro Blatt, in der Mitte schneiden. Ins Heft kleben – gilt auch für Kleisthenes und Perikles.</w:t>
             </w:r>
           </w:p>
         </w:tc>
@@ -410,6 +410,112 @@
           </w:tcPr>
           <w:p>
             <w:pPr>
+              <w:spacing w:after="30" w:before="0"/>
+            </w:pPr>
+            <w:r>
+              <w:rPr>
+                <w:b/>
+                <w:bCs/>
+                <w:sz w:val="18"/>
+                <w:szCs w:val="18"/>
+              </w:rPr>
+              <w:t xml:space="preserve">Figurenkarten mit Endschildern</w:t>
+            </w:r>
+          </w:p>
+          <w:p>
+            <w:pPr>
+              <w:spacing w:after="30" w:before="0"/>
+            </w:pPr>
+            <w:r>
+              <w:rPr>
+                <w:sz w:val="18"/>
+                <w:szCs w:val="18"/>
+              </w:rPr>
+              <w:t xml:space="preserve">Figurenkarten_Tafel.docx</w:t>
+            </w:r>
+          </w:p>
+        </w:tc>
+        <w:tc>
+          <w:tcPr>
+            <w:tcW w:type="dxa" w:w="2300"/>
+            <w:tcBorders>
+              <w:top w:val="single" w:color="BFB5A5" w:sz="4"/>
+              <w:left w:val="single" w:color="BFB5A5" w:sz="4"/>
+              <w:bottom w:val="single" w:color="BFB5A5" w:sz="4"/>
+              <w:right w:val="single" w:color="BFB5A5" w:sz="4"/>
+            </w:tcBorders>
+            <w:tcMar>
+              <w:top w:type="dxa" w:w="70"/>
+              <w:left w:type="dxa" w:w="100"/>
+              <w:bottom w:type="dxa" w:w="70"/>
+              <w:right w:type="dxa" w:w="100"/>
+            </w:tcMar>
+          </w:tcPr>
+          <w:p>
+            <w:pPr>
+              <w:spacing w:after="0" w:before="0"/>
+            </w:pPr>
+            <w:r>
+              <w:rPr>
+                <w:sz w:val="18"/>
+                <w:szCs w:val="18"/>
+              </w:rPr>
+              <w:t xml:space="preserve">1 × (5 Seiten)</w:t>
+            </w:r>
+          </w:p>
+        </w:tc>
+        <w:tc>
+          <w:tcPr>
+            <w:tcW w:type="dxa" w:w="4138"/>
+            <w:tcBorders>
+              <w:top w:val="single" w:color="BFB5A5" w:sz="4"/>
+              <w:left w:val="single" w:color="BFB5A5" w:sz="4"/>
+              <w:bottom w:val="single" w:color="BFB5A5" w:sz="4"/>
+              <w:right w:val="single" w:color="BFB5A5" w:sz="4"/>
+            </w:tcBorders>
+            <w:tcMar>
+              <w:top w:type="dxa" w:w="70"/>
+              <w:left w:type="dxa" w:w="100"/>
+              <w:bottom w:type="dxa" w:w="70"/>
+              <w:right w:type="dxa" w:w="100"/>
+            </w:tcMar>
+          </w:tcPr>
+          <w:p>
+            <w:pPr>
+              <w:spacing w:after="0" w:before="0"/>
+            </w:pPr>
+            <w:r>
+              <w:rPr>
+                <w:sz w:val="18"/>
+                <w:szCs w:val="18"/>
+              </w:rPr>
+              <w:t xml:space="preserve">Jede Seite halbieren. 9 Karten, dazu Magnete.</w:t>
+            </w:r>
+          </w:p>
+        </w:tc>
+      </w:tr>
+      <w:tr>
+        <w:trPr>
+          <w:cantSplit/>
+        </w:trPr>
+        <w:tc>
+          <w:tcPr>
+            <w:tcW w:type="dxa" w:w="3200"/>
+            <w:tcBorders>
+              <w:top w:val="single" w:color="BFB5A5" w:sz="4"/>
+              <w:left w:val="single" w:color="BFB5A5" w:sz="4"/>
+              <w:bottom w:val="single" w:color="BFB5A5" w:sz="4"/>
+              <w:right w:val="single" w:color="BFB5A5" w:sz="4"/>
+            </w:tcBorders>
+            <w:tcMar>
+              <w:top w:type="dxa" w:w="70"/>
+              <w:left w:type="dxa" w:w="100"/>
+              <w:bottom w:type="dxa" w:w="70"/>
+              <w:right w:type="dxa" w:w="100"/>
+            </w:tcMar>
+          </w:tcPr>
+          <w:p>
+            <w:pPr>
               <w:spacing w:after="0" w:before="0"/>
             </w:pPr>
             <w:r>
@@ -501,7 +607,7 @@
           <w:sz w:val="19"/>
           <w:szCs w:val="19"/>
         </w:rPr>
-        <w:t xml:space="preserve"> Raster, Schaubild-Erklärung und Urteil entstehen im Heft. Alle Aufträge stehen auf den Folien.</w:t>
+        <w:t xml:space="preserve"> Raster und Urteil entstehen im Heft. Alle Aufträge stehen auf den Folien.</w:t>
       </w:r>
     </w:p>
     <w:p>
@@ -542,7 +648,7 @@
           <w:sz w:val="20"/>
           <w:szCs w:val="20"/>
         </w:rPr>
-        <w:t xml:space="preserve">☐  Figurenkarten und Endschilder bereitlegen, an der Tafel Platz für die Linie lassen.</w:t>
+        <w:t xml:space="preserve">☐  Schaubild-Blatt kopieren und schneiden; Figurenkarten und Endschilder bereitlegen, an der Tafel Platz für die Linie lassen.</w:t>
       </w:r>
     </w:p>
     <w:p>
@@ -1618,7 +1724,7 @@
                 <w:sz w:val="18"/>
                 <w:szCs w:val="18"/>
               </w:rPr>
-              <w:t xml:space="preserve">Erklärschema in 5 Schritten. A erklärt das Schaubild im LB, B hakt ab, dann Wechsel. Ein ausgeloster Schüler erklärt das Schaubild auf Folie 11. Mustererklärung zeigen.</w:t>
+              <w:t xml:space="preserve">Blatt „Ein Verfassungsschaubild erklären“ austeilen. A erklärt das Schaubild im LB, B hakt ab, dann Wechsel. Ein ausgeloster Schüler erklärt das Schaubild auf Folie 11. Mustererklärung zeigen.</w:t>
             </w:r>
           </w:p>
         </w:tc>

</xml_diff>